<commit_message>
Freeze Chapter 1 v1.1 gold standard
Co-authored-by: Cursor <cursoragent@cursor.com>
</commit_message>
<xml_diff>
--- a/production/premium-notes/01-ch1-energy-causes-change-guided-notes-key.docx
+++ b/production/premium-notes/01-ch1-energy-causes-change-guided-notes-key.docx
@@ -181,6 +181,35 @@
         <w:t>Bold brown = exact answer · Italic gray = sample / acceptable response.</w:t>
       </w:r>
     </w:p>
+    <w:p>
+      <w:pPr>
+        <w:spacing w:before="0" w:after="120" w:line="280" w:lineRule="exact"/>
+      </w:pPr>
+      <w:r>
+        <w:rPr>
+          <w:rFonts w:ascii="Avenir Next" w:hAnsi="Avenir Next"/>
+          <w:b/>
+          <w:i w:val="0"/>
+          <w:color w:val="7A5620"/>
+          <w:sz w:val="24"/>
+          <w:u w:val="none"/>
+          <w:rFonts w:ascii="Avenir Next" w:hAnsi="Avenir Next" w:cs="Avenir Next"/>
+        </w:rPr>
+        <w:t xml:space="preserve">LANGUAGE NOTE  </w:t>
+      </w:r>
+      <w:r>
+        <w:rPr>
+          <w:rFonts w:ascii="Avenir Next" w:hAnsi="Avenir Next"/>
+          <w:b w:val="0"/>
+          <w:i/>
+          <w:color w:val="4A5268"/>
+          <w:sz w:val="24"/>
+          <w:u w:val="none"/>
+          <w:rFonts w:ascii="Avenir Next" w:hAnsi="Avenir Next" w:cs="Avenir Next"/>
+        </w:rPr>
+        <w:t>The Reader says “evidence, or proof.” Teach and use the word evidence (it is in the Big Question). If a student writes proof in the N1 blank, accept it and restate: “Yes — we say evidence.”</w:t>
+      </w:r>
+    </w:p>
     <w:tbl>
       <w:tblPr>
         <w:tblW w:type="auto" w:w="0"/>
@@ -271,41 +300,100 @@
         <w:t>Sample: “A pencil gets shorter and sharper.” (Accept any observed change.)</w:t>
       </w:r>
     </w:p>
+    <w:tbl>
+      <w:tblPr>
+        <w:tblW w:type="auto" w:w="0"/>
+        <w:tblLook w:firstColumn="1" w:firstRow="1" w:lastColumn="0" w:lastRow="0" w:noHBand="0" w:noVBand="1" w:val="04A0"/>
+        <w:tblBorders>
+          <w:top w:val="none"/>
+          <w:left w:val="none"/>
+          <w:bottom w:val="none"/>
+          <w:right w:val="none"/>
+          <w:insideH w:val="none"/>
+          <w:insideV w:val="none"/>
+        </w:tblBorders>
+      </w:tblPr>
+      <w:tblGrid>
+        <w:gridCol w:w="10656"/>
+      </w:tblGrid>
+      <w:tr>
+        <w:trPr>
+          <w:trHeight w:val="560" w:hRule="exact"/>
+        </w:trPr>
+        <w:tc>
+          <w:tcPr>
+            <w:tcW w:type="dxa" w:w="10656"/>
+            <w:tcMar>
+              <w:top w:w="0" w:type="dxa"/>
+              <w:left w:w="0" w:type="dxa"/>
+              <w:bottom w:w="0" w:type="dxa"/>
+              <w:right w:w="0" w:type="dxa"/>
+            </w:tcMar>
+            <w:tcBorders>
+              <w:bottom w:val="single" w:sz="8" w:color="1A1D26"/>
+            </w:tcBorders>
+          </w:tcPr>
+          <w:p>
+            <w:pPr>
+              <w:spacing w:before="0" w:after="0" w:line="40" w:lineRule="exact"/>
+            </w:pPr>
+            <w:r>
+              <w:rPr>
+                <w:rFonts w:ascii="Avenir Next" w:hAnsi="Avenir Next"/>
+                <w:b w:val="0"/>
+                <w:i w:val="0"/>
+                <w:color w:val="1A1D26"/>
+                <w:sz w:val="4"/>
+                <w:u w:val="none"/>
+                <w:rFonts w:ascii="Avenir Next" w:hAnsi="Avenir Next" w:cs="Avenir Next"/>
+              </w:rPr>
+            </w:r>
+          </w:p>
+        </w:tc>
+      </w:tr>
+      <w:tr>
+        <w:trPr>
+          <w:trHeight w:val="560" w:hRule="exact"/>
+        </w:trPr>
+        <w:tc>
+          <w:tcPr>
+            <w:tcW w:type="dxa" w:w="10656"/>
+            <w:tcMar>
+              <w:top w:w="0" w:type="dxa"/>
+              <w:left w:w="0" w:type="dxa"/>
+              <w:bottom w:w="0" w:type="dxa"/>
+              <w:right w:w="0" w:type="dxa"/>
+            </w:tcMar>
+            <w:tcBorders>
+              <w:bottom w:val="single" w:sz="8" w:color="1A1D26"/>
+            </w:tcBorders>
+          </w:tcPr>
+          <w:p>
+            <w:pPr>
+              <w:spacing w:before="0" w:after="0" w:line="40" w:lineRule="exact"/>
+            </w:pPr>
+            <w:r>
+              <w:rPr>
+                <w:rFonts w:ascii="Avenir Next" w:hAnsi="Avenir Next"/>
+                <w:b w:val="0"/>
+                <w:i w:val="0"/>
+                <w:color w:val="1A1D26"/>
+                <w:sz w:val="4"/>
+                <w:u w:val="none"/>
+                <w:rFonts w:ascii="Avenir Next" w:hAnsi="Avenir Next" w:cs="Avenir Next"/>
+              </w:rPr>
+            </w:r>
+          </w:p>
+        </w:tc>
+      </w:tr>
+    </w:tbl>
     <w:p>
       <w:pPr>
-        <w:spacing w:before="0" w:after="0" w:line="560" w:lineRule="exact"/>
-        <w:pBdr>
-          <w:bottom w:val="single" w:sz="8" w:space="4" w:color="1A1D26"/>
-        </w:pBdr>
+        <w:spacing w:before="0" w:after="80" w:line="120" w:lineRule="exact"/>
       </w:pPr>
       <w:r>
         <w:rPr>
-          <w:rFonts w:ascii="Avenir Next" w:hAnsi="Avenir Next"/>
-          <w:b w:val="0"/>
-          <w:i w:val="0"/>
-          <w:color w:val="1A1D26"/>
-          <w:sz w:val="29"/>
-          <w:u w:val="none"/>
-          <w:rFonts w:ascii="Avenir Next" w:hAnsi="Avenir Next" w:cs="Avenir Next"/>
-        </w:rPr>
-      </w:r>
-    </w:p>
-    <w:p>
-      <w:pPr>
-        <w:spacing w:before="0" w:after="0" w:line="560" w:lineRule="exact"/>
-        <w:pBdr>
-          <w:bottom w:val="single" w:sz="8" w:space="4" w:color="1A1D26"/>
-        </w:pBdr>
-      </w:pPr>
-      <w:r>
-        <w:rPr>
-          <w:rFonts w:ascii="Avenir Next" w:hAnsi="Avenir Next"/>
-          <w:b w:val="0"/>
-          <w:i w:val="0"/>
-          <w:color w:val="1A1D26"/>
-          <w:sz w:val="29"/>
-          <w:u w:val="none"/>
-          <w:rFonts w:ascii="Avenir Next" w:hAnsi="Avenir Next" w:cs="Avenir Next"/>
+          <w:sz w:val="4"/>
         </w:rPr>
       </w:r>
     </w:p>
@@ -549,7 +637,7 @@
     </w:p>
     <w:p>
       <w:pPr>
-        <w:spacing w:before="0" w:after="80" w:line="520" w:lineRule="exact"/>
+        <w:spacing w:before="0" w:after="40" w:line="480" w:lineRule="exact"/>
       </w:pPr>
       <w:r>
         <w:rPr>
@@ -561,7 +649,24 @@
           <w:u w:val="none"/>
           <w:rFonts w:ascii="Avenir Next" w:hAnsi="Avenir Next" w:cs="Avenir Next"/>
         </w:rPr>
-        <w:t xml:space="preserve">Energy has the ability to </w:t>
+        <w:t>Energy has the ability to cause change.</w:t>
+      </w:r>
+    </w:p>
+    <w:p>
+      <w:pPr>
+        <w:spacing w:before="0" w:after="160" w:line="520" w:lineRule="exact"/>
+      </w:pPr>
+      <w:r>
+        <w:rPr>
+          <w:rFonts w:ascii="Avenir Next" w:hAnsi="Avenir Next"/>
+          <w:b w:val="0"/>
+          <w:i w:val="0"/>
+          <w:color w:val="1A1D26"/>
+          <w:sz w:val="28"/>
+          <w:u w:val="none"/>
+          <w:rFonts w:ascii="Avenir Next" w:hAnsi="Avenir Next" w:cs="Avenir Next"/>
+        </w:rPr>
+        <w:t xml:space="preserve">When you see a change, you are seeing </w:t>
       </w:r>
       <w:r>
         <w:rPr>
@@ -573,7 +678,7 @@
           <w:u w:val="none"/>
           <w:rFonts w:ascii="Avenir Next" w:hAnsi="Avenir Next" w:cs="Avenir Next"/>
         </w:rPr>
-        <w:t>cause</w:t>
+        <w:t>evidence</w:t>
       </w:r>
       <w:r>
         <w:rPr>
@@ -585,48 +690,7 @@
           <w:u w:val="none"/>
           <w:rFonts w:ascii="Avenir Next" w:hAnsi="Avenir Next" w:cs="Avenir Next"/>
         </w:rPr>
-        <w:t xml:space="preserve">  </w:t>
-      </w:r>
-      <w:r>
-        <w:rPr>
-          <w:rFonts w:ascii="Avenir Next" w:hAnsi="Avenir Next"/>
-          <w:b/>
-          <w:i w:val="0"/>
-          <w:color w:val="7A5620"/>
-          <w:sz w:val="28"/>
-          <w:u w:val="none"/>
-          <w:rFonts w:ascii="Avenir Next" w:hAnsi="Avenir Next" w:cs="Avenir Next"/>
-        </w:rPr>
-        <w:t>change</w:t>
-      </w:r>
-      <w:r>
-        <w:rPr>
-          <w:rFonts w:ascii="Avenir Next" w:hAnsi="Avenir Next"/>
-          <w:b w:val="0"/>
-          <w:i w:val="0"/>
-          <w:color w:val="1A1D26"/>
-          <w:sz w:val="28"/>
-          <w:u w:val="none"/>
-          <w:rFonts w:ascii="Avenir Next" w:hAnsi="Avenir Next" w:cs="Avenir Next"/>
-        </w:rPr>
-        <w:t xml:space="preserve"> .</w:t>
-      </w:r>
-    </w:p>
-    <w:p>
-      <w:pPr>
-        <w:spacing w:before="0" w:after="120"/>
-      </w:pPr>
-      <w:r>
-        <w:rPr>
-          <w:rFonts w:ascii="Avenir Next" w:hAnsi="Avenir Next"/>
-          <w:b w:val="0"/>
-          <w:i/>
-          <w:color w:val="4A5268"/>
-          <w:sz w:val="24"/>
-          <w:u w:val="none"/>
-          <w:rFonts w:ascii="Avenir Next" w:hAnsi="Avenir Next" w:cs="Avenir Next"/>
-        </w:rPr>
-        <w:t>When you see a change, you are seeing evidence of energy.</w:t>
+        <w:t xml:space="preserve"> of energy.</w:t>
       </w:r>
     </w:p>
     <w:tbl>
@@ -809,57 +873,6 @@
       </w:tr>
     </w:tbl>
     <w:p>
-      <w:pPr>
-        <w:spacing w:before="0" w:after="80"/>
-      </w:pPr>
-      <w:r>
-        <w:rPr>
-          <w:sz w:val="4"/>
-        </w:rPr>
-      </w:r>
-    </w:p>
-    <w:p>
-      <w:pPr>
-        <w:spacing w:before="0" w:after="80" w:line="520" w:lineRule="exact"/>
-      </w:pPr>
-      <w:r>
-        <w:rPr>
-          <w:rFonts w:ascii="Avenir Next" w:hAnsi="Avenir Next"/>
-          <w:b w:val="0"/>
-          <w:i w:val="0"/>
-          <w:color w:val="1A1D26"/>
-          <w:sz w:val="28"/>
-          <w:u w:val="none"/>
-          <w:rFonts w:ascii="Avenir Next" w:hAnsi="Avenir Next" w:cs="Avenir Next"/>
-        </w:rPr>
-        <w:t xml:space="preserve">A change is </w:t>
-      </w:r>
-      <w:r>
-        <w:rPr>
-          <w:rFonts w:ascii="Avenir Next" w:hAnsi="Avenir Next"/>
-          <w:b/>
-          <w:i w:val="0"/>
-          <w:color w:val="7A5620"/>
-          <w:sz w:val="28"/>
-          <w:u w:val="none"/>
-          <w:rFonts w:ascii="Avenir Next" w:hAnsi="Avenir Next" w:cs="Avenir Next"/>
-        </w:rPr>
-        <w:t>evidence</w:t>
-      </w:r>
-      <w:r>
-        <w:rPr>
-          <w:rFonts w:ascii="Avenir Next" w:hAnsi="Avenir Next"/>
-          <w:b w:val="0"/>
-          <w:i w:val="0"/>
-          <w:color w:val="1A1D26"/>
-          <w:sz w:val="28"/>
-          <w:u w:val="none"/>
-          <w:rFonts w:ascii="Avenir Next" w:hAnsi="Avenir Next" w:cs="Avenir Next"/>
-        </w:rPr>
-        <w:t xml:space="preserve"> that energy is involved.</w:t>
-      </w:r>
-    </w:p>
-    <w:p>
       <w:r>
         <w:br w:type="page"/>
       </w:r>
@@ -956,7 +969,7 @@
           <w:u w:val="none"/>
           <w:rFonts w:ascii="Avenir Next" w:hAnsi="Avenir Next" w:cs="Avenir Next"/>
         </w:rPr>
-        <w:t>Write or draw one example that shows a change for each form.</w:t>
+        <w:t>Write one example that shows a change for each form.</w:t>
       </w:r>
     </w:p>
     <w:tbl>
@@ -1037,7 +1050,7 @@
       </w:tr>
       <w:tr>
         <w:trPr>
-          <w:trHeight w:val="680" w:hRule="atLeast"/>
+          <w:trHeight w:val="700" w:hRule="atLeast"/>
         </w:trPr>
         <w:tc>
           <w:tcPr>
@@ -1045,12 +1058,18 @@
             <w:tcMar>
               <w:top w:w="40" w:type="dxa"/>
               <w:left w:w="80" w:type="dxa"/>
-              <w:bottom w:w="40" w:type="dxa"/>
+              <w:bottom w:w="20" w:type="dxa"/>
               <w:right w:w="80" w:type="dxa"/>
             </w:tcMar>
-            <w:vAlign w:val="center"/>
+            <w:vAlign w:val="bottom"/>
+            <w:tcBorders>
+              <w:bottom w:val="single" w:sz="6" w:color="9AA0B4"/>
+            </w:tcBorders>
           </w:tcPr>
           <w:p>
+            <w:pPr>
+              <w:spacing w:before="0" w:after="0"/>
+            </w:pPr>
             <w:r>
               <w:rPr>
                 <w:rFonts w:ascii="Avenir Next" w:hAnsi="Avenir Next"/>
@@ -1071,15 +1090,18 @@
             <w:tcMar>
               <w:top w:w="40" w:type="dxa"/>
               <w:left w:w="80" w:type="dxa"/>
-              <w:bottom w:w="40" w:type="dxa"/>
+              <w:bottom w:w="20" w:type="dxa"/>
               <w:right w:w="80" w:type="dxa"/>
             </w:tcMar>
-            <w:vAlign w:val="center"/>
+            <w:vAlign w:val="bottom"/>
             <w:tcBorders>
               <w:bottom w:val="single" w:sz="8" w:color="1A1D26"/>
             </w:tcBorders>
           </w:tcPr>
           <w:p>
+            <w:pPr>
+              <w:spacing w:before="0" w:after="0"/>
+            </w:pPr>
             <w:r>
               <w:rPr>
                 <w:rFonts w:ascii="Avenir Next" w:hAnsi="Avenir Next"/>
@@ -1097,7 +1119,7 @@
       </w:tr>
       <w:tr>
         <w:trPr>
-          <w:trHeight w:val="680" w:hRule="atLeast"/>
+          <w:trHeight w:val="700" w:hRule="atLeast"/>
         </w:trPr>
         <w:tc>
           <w:tcPr>
@@ -1105,12 +1127,18 @@
             <w:tcMar>
               <w:top w:w="40" w:type="dxa"/>
               <w:left w:w="80" w:type="dxa"/>
-              <w:bottom w:w="40" w:type="dxa"/>
+              <w:bottom w:w="20" w:type="dxa"/>
               <w:right w:w="80" w:type="dxa"/>
             </w:tcMar>
-            <w:vAlign w:val="center"/>
+            <w:vAlign w:val="bottom"/>
+            <w:tcBorders>
+              <w:bottom w:val="single" w:sz="6" w:color="9AA0B4"/>
+            </w:tcBorders>
           </w:tcPr>
           <w:p>
+            <w:pPr>
+              <w:spacing w:before="0" w:after="0"/>
+            </w:pPr>
             <w:r>
               <w:rPr>
                 <w:rFonts w:ascii="Avenir Next" w:hAnsi="Avenir Next"/>
@@ -1131,15 +1159,18 @@
             <w:tcMar>
               <w:top w:w="40" w:type="dxa"/>
               <w:left w:w="80" w:type="dxa"/>
-              <w:bottom w:w="40" w:type="dxa"/>
+              <w:bottom w:w="20" w:type="dxa"/>
               <w:right w:w="80" w:type="dxa"/>
             </w:tcMar>
-            <w:vAlign w:val="center"/>
+            <w:vAlign w:val="bottom"/>
             <w:tcBorders>
               <w:bottom w:val="single" w:sz="8" w:color="1A1D26"/>
             </w:tcBorders>
           </w:tcPr>
           <w:p>
+            <w:pPr>
+              <w:spacing w:before="0" w:after="0"/>
+            </w:pPr>
             <w:r>
               <w:rPr>
                 <w:rFonts w:ascii="Avenir Next" w:hAnsi="Avenir Next"/>
@@ -1157,7 +1188,7 @@
       </w:tr>
       <w:tr>
         <w:trPr>
-          <w:trHeight w:val="680" w:hRule="atLeast"/>
+          <w:trHeight w:val="700" w:hRule="atLeast"/>
         </w:trPr>
         <w:tc>
           <w:tcPr>
@@ -1165,12 +1196,18 @@
             <w:tcMar>
               <w:top w:w="40" w:type="dxa"/>
               <w:left w:w="80" w:type="dxa"/>
-              <w:bottom w:w="40" w:type="dxa"/>
+              <w:bottom w:w="20" w:type="dxa"/>
               <w:right w:w="80" w:type="dxa"/>
             </w:tcMar>
-            <w:vAlign w:val="center"/>
+            <w:vAlign w:val="bottom"/>
+            <w:tcBorders>
+              <w:bottom w:val="single" w:sz="6" w:color="9AA0B4"/>
+            </w:tcBorders>
           </w:tcPr>
           <w:p>
+            <w:pPr>
+              <w:spacing w:before="0" w:after="0"/>
+            </w:pPr>
             <w:r>
               <w:rPr>
                 <w:rFonts w:ascii="Avenir Next" w:hAnsi="Avenir Next"/>
@@ -1191,15 +1228,18 @@
             <w:tcMar>
               <w:top w:w="40" w:type="dxa"/>
               <w:left w:w="80" w:type="dxa"/>
-              <w:bottom w:w="40" w:type="dxa"/>
+              <w:bottom w:w="20" w:type="dxa"/>
               <w:right w:w="80" w:type="dxa"/>
             </w:tcMar>
-            <w:vAlign w:val="center"/>
+            <w:vAlign w:val="bottom"/>
             <w:tcBorders>
               <w:bottom w:val="single" w:sz="8" w:color="1A1D26"/>
             </w:tcBorders>
           </w:tcPr>
           <w:p>
+            <w:pPr>
+              <w:spacing w:before="0" w:after="0"/>
+            </w:pPr>
             <w:r>
               <w:rPr>
                 <w:rFonts w:ascii="Avenir Next" w:hAnsi="Avenir Next"/>
@@ -1217,7 +1257,7 @@
       </w:tr>
       <w:tr>
         <w:trPr>
-          <w:trHeight w:val="680" w:hRule="atLeast"/>
+          <w:trHeight w:val="700" w:hRule="atLeast"/>
         </w:trPr>
         <w:tc>
           <w:tcPr>
@@ -1225,12 +1265,18 @@
             <w:tcMar>
               <w:top w:w="40" w:type="dxa"/>
               <w:left w:w="80" w:type="dxa"/>
-              <w:bottom w:w="40" w:type="dxa"/>
+              <w:bottom w:w="20" w:type="dxa"/>
               <w:right w:w="80" w:type="dxa"/>
             </w:tcMar>
-            <w:vAlign w:val="center"/>
+            <w:vAlign w:val="bottom"/>
+            <w:tcBorders>
+              <w:bottom w:val="single" w:sz="6" w:color="9AA0B4"/>
+            </w:tcBorders>
           </w:tcPr>
           <w:p>
+            <w:pPr>
+              <w:spacing w:before="0" w:after="0"/>
+            </w:pPr>
             <w:r>
               <w:rPr>
                 <w:rFonts w:ascii="Avenir Next" w:hAnsi="Avenir Next"/>
@@ -1251,15 +1297,18 @@
             <w:tcMar>
               <w:top w:w="40" w:type="dxa"/>
               <w:left w:w="80" w:type="dxa"/>
-              <w:bottom w:w="40" w:type="dxa"/>
+              <w:bottom w:w="20" w:type="dxa"/>
               <w:right w:w="80" w:type="dxa"/>
             </w:tcMar>
-            <w:vAlign w:val="center"/>
+            <w:vAlign w:val="bottom"/>
             <w:tcBorders>
               <w:bottom w:val="single" w:sz="8" w:color="1A1D26"/>
             </w:tcBorders>
           </w:tcPr>
           <w:p>
+            <w:pPr>
+              <w:spacing w:before="0" w:after="0"/>
+            </w:pPr>
             <w:r>
               <w:rPr>
                 <w:rFonts w:ascii="Avenir Next" w:hAnsi="Avenir Next"/>
@@ -1277,7 +1326,7 @@
       </w:tr>
       <w:tr>
         <w:trPr>
-          <w:trHeight w:val="680" w:hRule="atLeast"/>
+          <w:trHeight w:val="700" w:hRule="atLeast"/>
         </w:trPr>
         <w:tc>
           <w:tcPr>
@@ -1285,12 +1334,18 @@
             <w:tcMar>
               <w:top w:w="40" w:type="dxa"/>
               <w:left w:w="80" w:type="dxa"/>
-              <w:bottom w:w="40" w:type="dxa"/>
+              <w:bottom w:w="20" w:type="dxa"/>
               <w:right w:w="80" w:type="dxa"/>
             </w:tcMar>
-            <w:vAlign w:val="center"/>
+            <w:vAlign w:val="bottom"/>
+            <w:tcBorders>
+              <w:bottom w:val="single" w:sz="6" w:color="9AA0B4"/>
+            </w:tcBorders>
           </w:tcPr>
           <w:p>
+            <w:pPr>
+              <w:spacing w:before="0" w:after="0"/>
+            </w:pPr>
             <w:r>
               <w:rPr>
                 <w:rFonts w:ascii="Avenir Next" w:hAnsi="Avenir Next"/>
@@ -1311,15 +1366,18 @@
             <w:tcMar>
               <w:top w:w="40" w:type="dxa"/>
               <w:left w:w="80" w:type="dxa"/>
-              <w:bottom w:w="40" w:type="dxa"/>
+              <w:bottom w:w="20" w:type="dxa"/>
               <w:right w:w="80" w:type="dxa"/>
             </w:tcMar>
-            <w:vAlign w:val="center"/>
+            <w:vAlign w:val="bottom"/>
             <w:tcBorders>
               <w:bottom w:val="single" w:sz="8" w:color="1A1D26"/>
             </w:tcBorders>
           </w:tcPr>
           <w:p>
+            <w:pPr>
+              <w:spacing w:before="0" w:after="0"/>
+            </w:pPr>
             <w:r>
               <w:rPr>
                 <w:rFonts w:ascii="Avenir Next" w:hAnsi="Avenir Next"/>
@@ -1810,7 +1868,7 @@
       </w:tr>
       <w:tr>
         <w:trPr>
-          <w:trHeight w:val="680" w:hRule="atLeast"/>
+          <w:trHeight w:val="700" w:hRule="atLeast"/>
         </w:trPr>
         <w:tc>
           <w:tcPr>
@@ -1818,12 +1876,18 @@
             <w:tcMar>
               <w:top w:w="40" w:type="dxa"/>
               <w:left w:w="80" w:type="dxa"/>
-              <w:bottom w:w="40" w:type="dxa"/>
+              <w:bottom w:w="20" w:type="dxa"/>
               <w:right w:w="80" w:type="dxa"/>
             </w:tcMar>
-            <w:vAlign w:val="center"/>
+            <w:vAlign w:val="bottom"/>
+            <w:tcBorders>
+              <w:bottom w:val="single" w:sz="6" w:color="9AA0B4"/>
+            </w:tcBorders>
           </w:tcPr>
           <w:p>
+            <w:pPr>
+              <w:spacing w:before="0" w:after="0"/>
+            </w:pPr>
             <w:r>
               <w:rPr>
                 <w:rFonts w:ascii="Avenir Next" w:hAnsi="Avenir Next"/>
@@ -1844,15 +1908,18 @@
             <w:tcMar>
               <w:top w:w="40" w:type="dxa"/>
               <w:left w:w="80" w:type="dxa"/>
-              <w:bottom w:w="40" w:type="dxa"/>
+              <w:bottom w:w="20" w:type="dxa"/>
               <w:right w:w="80" w:type="dxa"/>
             </w:tcMar>
-            <w:vAlign w:val="center"/>
+            <w:vAlign w:val="bottom"/>
             <w:tcBorders>
               <w:bottom w:val="single" w:sz="8" w:color="1A1D26"/>
             </w:tcBorders>
           </w:tcPr>
           <w:p>
+            <w:pPr>
+              <w:spacing w:before="0" w:after="0"/>
+            </w:pPr>
             <w:r>
               <w:rPr>
                 <w:rFonts w:ascii="Avenir Next" w:hAnsi="Avenir Next"/>
@@ -1870,7 +1937,7 @@
       </w:tr>
       <w:tr>
         <w:trPr>
-          <w:trHeight w:val="680" w:hRule="atLeast"/>
+          <w:trHeight w:val="700" w:hRule="atLeast"/>
         </w:trPr>
         <w:tc>
           <w:tcPr>
@@ -1878,12 +1945,18 @@
             <w:tcMar>
               <w:top w:w="40" w:type="dxa"/>
               <w:left w:w="80" w:type="dxa"/>
-              <w:bottom w:w="40" w:type="dxa"/>
+              <w:bottom w:w="20" w:type="dxa"/>
               <w:right w:w="80" w:type="dxa"/>
             </w:tcMar>
-            <w:vAlign w:val="center"/>
+            <w:vAlign w:val="bottom"/>
+            <w:tcBorders>
+              <w:bottom w:val="single" w:sz="6" w:color="9AA0B4"/>
+            </w:tcBorders>
           </w:tcPr>
           <w:p>
+            <w:pPr>
+              <w:spacing w:before="0" w:after="0"/>
+            </w:pPr>
             <w:r>
               <w:rPr>
                 <w:rFonts w:ascii="Avenir Next" w:hAnsi="Avenir Next"/>
@@ -1904,15 +1977,18 @@
             <w:tcMar>
               <w:top w:w="40" w:type="dxa"/>
               <w:left w:w="80" w:type="dxa"/>
-              <w:bottom w:w="40" w:type="dxa"/>
+              <w:bottom w:w="20" w:type="dxa"/>
               <w:right w:w="80" w:type="dxa"/>
             </w:tcMar>
-            <w:vAlign w:val="center"/>
+            <w:vAlign w:val="bottom"/>
             <w:tcBorders>
               <w:bottom w:val="single" w:sz="8" w:color="1A1D26"/>
             </w:tcBorders>
           </w:tcPr>
           <w:p>
+            <w:pPr>
+              <w:spacing w:before="0" w:after="0"/>
+            </w:pPr>
             <w:r>
               <w:rPr>
                 <w:rFonts w:ascii="Avenir Next" w:hAnsi="Avenir Next"/>
@@ -1930,7 +2006,7 @@
       </w:tr>
       <w:tr>
         <w:trPr>
-          <w:trHeight w:val="680" w:hRule="atLeast"/>
+          <w:trHeight w:val="700" w:hRule="atLeast"/>
         </w:trPr>
         <w:tc>
           <w:tcPr>
@@ -1938,12 +2014,18 @@
             <w:tcMar>
               <w:top w:w="40" w:type="dxa"/>
               <w:left w:w="80" w:type="dxa"/>
-              <w:bottom w:w="40" w:type="dxa"/>
+              <w:bottom w:w="20" w:type="dxa"/>
               <w:right w:w="80" w:type="dxa"/>
             </w:tcMar>
-            <w:vAlign w:val="center"/>
+            <w:vAlign w:val="bottom"/>
+            <w:tcBorders>
+              <w:bottom w:val="single" w:sz="6" w:color="9AA0B4"/>
+            </w:tcBorders>
           </w:tcPr>
           <w:p>
+            <w:pPr>
+              <w:spacing w:before="0" w:after="0"/>
+            </w:pPr>
             <w:r>
               <w:rPr>
                 <w:rFonts w:ascii="Avenir Next" w:hAnsi="Avenir Next"/>
@@ -1964,15 +2046,18 @@
             <w:tcMar>
               <w:top w:w="40" w:type="dxa"/>
               <w:left w:w="80" w:type="dxa"/>
-              <w:bottom w:w="40" w:type="dxa"/>
+              <w:bottom w:w="20" w:type="dxa"/>
               <w:right w:w="80" w:type="dxa"/>
             </w:tcMar>
-            <w:vAlign w:val="center"/>
+            <w:vAlign w:val="bottom"/>
             <w:tcBorders>
               <w:bottom w:val="single" w:sz="8" w:color="1A1D26"/>
             </w:tcBorders>
           </w:tcPr>
           <w:p>
+            <w:pPr>
+              <w:spacing w:before="0" w:after="0"/>
+            </w:pPr>
             <w:r>
               <w:rPr>
                 <w:rFonts w:ascii="Avenir Next" w:hAnsi="Avenir Next"/>
@@ -2115,7 +2200,7 @@
           <w:u w:val="none"/>
           <w:rFonts w:ascii="Avenir Next" w:hAnsi="Avenir Next" w:cs="Avenir Next"/>
         </w:rPr>
-        <w:t>Reader pp. 1–6</w:t>
+        <w:t>Reader pp. 1–5</w:t>
       </w:r>
     </w:p>
     <w:p>
@@ -2154,8 +2239,8 @@
       </w:tblGrid>
       <w:tr>
         <w:trPr>
-          <w:trHeight w:val="2000" w:hRule="exact"/>
-          <w:trHeight w:val="2000" w:hRule="exact"/>
+          <w:trHeight w:val="1300" w:hRule="exact"/>
+          <w:trHeight w:val="1300" w:hRule="exact"/>
         </w:trPr>
         <w:tc>
           <w:tcPr>
@@ -2194,6 +2279,23 @@
                 <w:rFonts w:ascii="Avenir Next" w:hAnsi="Avenir Next" w:cs="Avenir Next"/>
               </w:rPr>
               <w:t>BEFORE</w:t>
+            </w:r>
+          </w:p>
+          <w:p>
+            <w:pPr>
+              <w:spacing w:before="80" w:after="0"/>
+            </w:pPr>
+            <w:r>
+              <w:rPr>
+                <w:rFonts w:ascii="Avenir Next" w:hAnsi="Avenir Next"/>
+                <w:b w:val="0"/>
+                <w:i/>
+                <w:color w:val="4A5268"/>
+                <w:sz w:val="24"/>
+                <w:u w:val="none"/>
+                <w:rFonts w:ascii="Avenir Next" w:hAnsi="Avenir Next" w:cs="Avenir Next"/>
+              </w:rPr>
+              <w:t>Sample: a dull pencil, long, rounded tip</w:t>
             </w:r>
           </w:p>
         </w:tc>
@@ -2236,6 +2338,23 @@
               <w:t>AFTER</w:t>
             </w:r>
           </w:p>
+          <w:p>
+            <w:pPr>
+              <w:spacing w:before="80" w:after="0"/>
+            </w:pPr>
+            <w:r>
+              <w:rPr>
+                <w:rFonts w:ascii="Avenir Next" w:hAnsi="Avenir Next"/>
+                <w:b w:val="0"/>
+                <w:i/>
+                <w:color w:val="4A5268"/>
+                <w:sz w:val="24"/>
+                <w:u w:val="none"/>
+                <w:rFonts w:ascii="Avenir Next" w:hAnsi="Avenir Next" w:cs="Avenir Next"/>
+              </w:rPr>
+              <w:t>Sample: shorter pencil, sharp tip, shavings</w:t>
+            </w:r>
+          </w:p>
         </w:tc>
       </w:tr>
     </w:tbl>
@@ -2268,23 +2387,73 @@
     </w:p>
     <w:p>
       <w:pPr>
-        <w:spacing w:before="0" w:after="0" w:line="560" w:lineRule="exact"/>
-        <w:pBdr>
-          <w:bottom w:val="single" w:sz="8" w:space="4" w:color="1A1D26"/>
-        </w:pBdr>
+        <w:spacing w:before="0" w:after="40"/>
       </w:pPr>
       <w:r>
         <w:rPr>
           <w:rFonts w:ascii="Avenir Next" w:hAnsi="Avenir Next"/>
           <w:b w:val="0"/>
-          <w:i w:val="0"/>
-          <w:color w:val="1A1D26"/>
-          <w:sz w:val="28"/>
+          <w:i/>
+          <w:color w:val="4A5268"/>
+          <w:sz w:val="24"/>
           <w:u w:val="none"/>
           <w:rFonts w:ascii="Avenir Next" w:hAnsi="Avenir Next" w:cs="Avenir Next"/>
         </w:rPr>
+        <w:t>Sample: “The pencil got shorter and sharper.” (Accept any observed change.)</w:t>
       </w:r>
     </w:p>
+    <w:tbl>
+      <w:tblPr>
+        <w:tblW w:type="auto" w:w="0"/>
+        <w:tblLook w:firstColumn="1" w:firstRow="1" w:lastColumn="0" w:lastRow="0" w:noHBand="0" w:noVBand="1" w:val="04A0"/>
+        <w:tblBorders>
+          <w:top w:val="none"/>
+          <w:left w:val="none"/>
+          <w:bottom w:val="none"/>
+          <w:right w:val="none"/>
+          <w:insideH w:val="none"/>
+          <w:insideV w:val="none"/>
+        </w:tblBorders>
+      </w:tblPr>
+      <w:tblGrid>
+        <w:gridCol w:w="10656"/>
+      </w:tblGrid>
+      <w:tr>
+        <w:trPr>
+          <w:trHeight w:val="560" w:hRule="exact"/>
+        </w:trPr>
+        <w:tc>
+          <w:tcPr>
+            <w:tcW w:type="dxa" w:w="10656"/>
+            <w:tcMar>
+              <w:top w:w="0" w:type="dxa"/>
+              <w:left w:w="0" w:type="dxa"/>
+              <w:bottom w:w="0" w:type="dxa"/>
+              <w:right w:w="0" w:type="dxa"/>
+            </w:tcMar>
+            <w:tcBorders>
+              <w:bottom w:val="single" w:sz="8" w:color="1A1D26"/>
+            </w:tcBorders>
+          </w:tcPr>
+          <w:p>
+            <w:pPr>
+              <w:spacing w:before="0" w:after="0" w:line="40" w:lineRule="exact"/>
+            </w:pPr>
+            <w:r>
+              <w:rPr>
+                <w:rFonts w:ascii="Avenir Next" w:hAnsi="Avenir Next"/>
+                <w:b w:val="0"/>
+                <w:i w:val="0"/>
+                <w:color w:val="1A1D26"/>
+                <w:sz w:val="4"/>
+                <w:u w:val="none"/>
+                <w:rFonts w:ascii="Avenir Next" w:hAnsi="Avenir Next" w:cs="Avenir Next"/>
+              </w:rPr>
+            </w:r>
+          </w:p>
+        </w:tc>
+      </w:tr>
+    </w:tbl>
     <w:p>
       <w:pPr>
         <w:spacing w:before="0" w:after="120"/>
@@ -2407,44 +2576,128 @@
         <w:t>Sample: “We know because we see a change, like a ball starting to move or a light turning on.” (Accept any response connecting a change to evidence of energy.)</w:t>
       </w:r>
     </w:p>
-    <w:p>
-      <w:pPr>
-        <w:spacing w:before="0" w:after="0" w:line="560" w:lineRule="exact"/>
-        <w:pBdr>
-          <w:bottom w:val="single" w:sz="8" w:space="4" w:color="1A1D26"/>
-        </w:pBdr>
-      </w:pPr>
-      <w:r>
-        <w:rPr>
-          <w:rFonts w:ascii="Avenir Next" w:hAnsi="Avenir Next"/>
-          <w:b w:val="0"/>
-          <w:i w:val="0"/>
-          <w:color w:val="1A1D26"/>
-          <w:sz w:val="29"/>
-          <w:u w:val="none"/>
-          <w:rFonts w:ascii="Avenir Next" w:hAnsi="Avenir Next" w:cs="Avenir Next"/>
-        </w:rPr>
-      </w:r>
-    </w:p>
-    <w:p>
-      <w:pPr>
-        <w:spacing w:before="0" w:after="0" w:line="560" w:lineRule="exact"/>
-        <w:pBdr>
-          <w:bottom w:val="single" w:sz="8" w:space="4" w:color="1A1D26"/>
-        </w:pBdr>
-      </w:pPr>
-      <w:r>
-        <w:rPr>
-          <w:rFonts w:ascii="Avenir Next" w:hAnsi="Avenir Next"/>
-          <w:b w:val="0"/>
-          <w:i w:val="0"/>
-          <w:color w:val="1A1D26"/>
-          <w:sz w:val="29"/>
-          <w:u w:val="none"/>
-          <w:rFonts w:ascii="Avenir Next" w:hAnsi="Avenir Next" w:cs="Avenir Next"/>
-        </w:rPr>
-      </w:r>
-    </w:p>
+    <w:tbl>
+      <w:tblPr>
+        <w:tblW w:type="auto" w:w="0"/>
+        <w:tblLook w:firstColumn="1" w:firstRow="1" w:lastColumn="0" w:lastRow="0" w:noHBand="0" w:noVBand="1" w:val="04A0"/>
+        <w:tblBorders>
+          <w:top w:val="none"/>
+          <w:left w:val="none"/>
+          <w:bottom w:val="none"/>
+          <w:right w:val="none"/>
+          <w:insideH w:val="none"/>
+          <w:insideV w:val="none"/>
+        </w:tblBorders>
+      </w:tblPr>
+      <w:tblGrid>
+        <w:gridCol w:w="10656"/>
+      </w:tblGrid>
+      <w:tr>
+        <w:trPr>
+          <w:trHeight w:val="560" w:hRule="exact"/>
+        </w:trPr>
+        <w:tc>
+          <w:tcPr>
+            <w:tcW w:type="dxa" w:w="10656"/>
+            <w:tcMar>
+              <w:top w:w="0" w:type="dxa"/>
+              <w:left w:w="0" w:type="dxa"/>
+              <w:bottom w:w="0" w:type="dxa"/>
+              <w:right w:w="0" w:type="dxa"/>
+            </w:tcMar>
+            <w:tcBorders>
+              <w:bottom w:val="single" w:sz="8" w:color="1A1D26"/>
+            </w:tcBorders>
+          </w:tcPr>
+          <w:p>
+            <w:pPr>
+              <w:spacing w:before="0" w:after="0" w:line="40" w:lineRule="exact"/>
+            </w:pPr>
+            <w:r>
+              <w:rPr>
+                <w:rFonts w:ascii="Avenir Next" w:hAnsi="Avenir Next"/>
+                <w:b w:val="0"/>
+                <w:i w:val="0"/>
+                <w:color w:val="1A1D26"/>
+                <w:sz w:val="4"/>
+                <w:u w:val="none"/>
+                <w:rFonts w:ascii="Avenir Next" w:hAnsi="Avenir Next" w:cs="Avenir Next"/>
+              </w:rPr>
+            </w:r>
+          </w:p>
+        </w:tc>
+      </w:tr>
+      <w:tr>
+        <w:trPr>
+          <w:trHeight w:val="560" w:hRule="exact"/>
+        </w:trPr>
+        <w:tc>
+          <w:tcPr>
+            <w:tcW w:type="dxa" w:w="10656"/>
+            <w:tcMar>
+              <w:top w:w="0" w:type="dxa"/>
+              <w:left w:w="0" w:type="dxa"/>
+              <w:bottom w:w="0" w:type="dxa"/>
+              <w:right w:w="0" w:type="dxa"/>
+            </w:tcMar>
+            <w:tcBorders>
+              <w:bottom w:val="single" w:sz="8" w:color="1A1D26"/>
+            </w:tcBorders>
+          </w:tcPr>
+          <w:p>
+            <w:pPr>
+              <w:spacing w:before="0" w:after="0" w:line="40" w:lineRule="exact"/>
+            </w:pPr>
+            <w:r>
+              <w:rPr>
+                <w:rFonts w:ascii="Avenir Next" w:hAnsi="Avenir Next"/>
+                <w:b w:val="0"/>
+                <w:i w:val="0"/>
+                <w:color w:val="1A1D26"/>
+                <w:sz w:val="4"/>
+                <w:u w:val="none"/>
+                <w:rFonts w:ascii="Avenir Next" w:hAnsi="Avenir Next" w:cs="Avenir Next"/>
+              </w:rPr>
+            </w:r>
+          </w:p>
+        </w:tc>
+      </w:tr>
+      <w:tr>
+        <w:trPr>
+          <w:trHeight w:val="560" w:hRule="exact"/>
+        </w:trPr>
+        <w:tc>
+          <w:tcPr>
+            <w:tcW w:type="dxa" w:w="10656"/>
+            <w:tcMar>
+              <w:top w:w="0" w:type="dxa"/>
+              <w:left w:w="0" w:type="dxa"/>
+              <w:bottom w:w="0" w:type="dxa"/>
+              <w:right w:w="0" w:type="dxa"/>
+            </w:tcMar>
+            <w:tcBorders>
+              <w:bottom w:val="single" w:sz="8" w:color="1A1D26"/>
+            </w:tcBorders>
+          </w:tcPr>
+          <w:p>
+            <w:pPr>
+              <w:spacing w:before="0" w:after="0" w:line="40" w:lineRule="exact"/>
+            </w:pPr>
+            <w:r>
+              <w:rPr>
+                <w:rFonts w:ascii="Avenir Next" w:hAnsi="Avenir Next"/>
+                <w:b w:val="0"/>
+                <w:i w:val="0"/>
+                <w:color w:val="1A1D26"/>
+                <w:sz w:val="4"/>
+                <w:u w:val="none"/>
+                <w:rFonts w:ascii="Avenir Next" w:hAnsi="Avenir Next" w:cs="Avenir Next"/>
+              </w:rPr>
+            </w:r>
+          </w:p>
+        </w:tc>
+      </w:tr>
+    </w:tbl>
     <w:tbl>
       <w:tblPr>
         <w:tblW w:type="auto" w:w="0"/>
@@ -2515,63 +2768,141 @@
           <w:u w:val="none"/>
           <w:rFonts w:ascii="Avenir Next" w:hAnsi="Avenir Next" w:cs="Avenir Next"/>
         </w:rPr>
-        <w:t>Sample: “We observe evidence of energy causing change everywhere — things move, make sound, light up, heat up, or change shape.” (Accept any response naming a change as evidence.)</w:t>
+        <w:t>Sample: “We see evidence of energy when things move, make sound, light up, heat up, or change shape.” (Accept any change named as evidence.)</w:t>
       </w:r>
     </w:p>
+    <w:tbl>
+      <w:tblPr>
+        <w:tblW w:type="auto" w:w="0"/>
+        <w:tblLook w:firstColumn="1" w:firstRow="1" w:lastColumn="0" w:lastRow="0" w:noHBand="0" w:noVBand="1" w:val="04A0"/>
+        <w:tblBorders>
+          <w:top w:val="none"/>
+          <w:left w:val="none"/>
+          <w:bottom w:val="none"/>
+          <w:right w:val="none"/>
+          <w:insideH w:val="none"/>
+          <w:insideV w:val="none"/>
+        </w:tblBorders>
+      </w:tblPr>
+      <w:tblGrid>
+        <w:gridCol w:w="10656"/>
+      </w:tblGrid>
+      <w:tr>
+        <w:trPr>
+          <w:trHeight w:val="560" w:hRule="exact"/>
+        </w:trPr>
+        <w:tc>
+          <w:tcPr>
+            <w:tcW w:type="dxa" w:w="10656"/>
+            <w:tcMar>
+              <w:top w:w="0" w:type="dxa"/>
+              <w:left w:w="0" w:type="dxa"/>
+              <w:bottom w:w="0" w:type="dxa"/>
+              <w:right w:w="0" w:type="dxa"/>
+            </w:tcMar>
+            <w:tcBorders>
+              <w:bottom w:val="single" w:sz="8" w:color="1A1D26"/>
+            </w:tcBorders>
+          </w:tcPr>
+          <w:p>
+            <w:pPr>
+              <w:spacing w:before="0" w:after="0" w:line="40" w:lineRule="exact"/>
+            </w:pPr>
+            <w:r>
+              <w:rPr>
+                <w:rFonts w:ascii="Avenir Next" w:hAnsi="Avenir Next"/>
+                <w:b w:val="0"/>
+                <w:i w:val="0"/>
+                <w:color w:val="1A1D26"/>
+                <w:sz w:val="4"/>
+                <w:u w:val="none"/>
+                <w:rFonts w:ascii="Avenir Next" w:hAnsi="Avenir Next" w:cs="Avenir Next"/>
+              </w:rPr>
+            </w:r>
+          </w:p>
+        </w:tc>
+      </w:tr>
+      <w:tr>
+        <w:trPr>
+          <w:trHeight w:val="560" w:hRule="exact"/>
+        </w:trPr>
+        <w:tc>
+          <w:tcPr>
+            <w:tcW w:type="dxa" w:w="10656"/>
+            <w:tcMar>
+              <w:top w:w="0" w:type="dxa"/>
+              <w:left w:w="0" w:type="dxa"/>
+              <w:bottom w:w="0" w:type="dxa"/>
+              <w:right w:w="0" w:type="dxa"/>
+            </w:tcMar>
+            <w:tcBorders>
+              <w:bottom w:val="single" w:sz="8" w:color="1A1D26"/>
+            </w:tcBorders>
+          </w:tcPr>
+          <w:p>
+            <w:pPr>
+              <w:spacing w:before="0" w:after="0" w:line="40" w:lineRule="exact"/>
+            </w:pPr>
+            <w:r>
+              <w:rPr>
+                <w:rFonts w:ascii="Avenir Next" w:hAnsi="Avenir Next"/>
+                <w:b w:val="0"/>
+                <w:i w:val="0"/>
+                <w:color w:val="1A1D26"/>
+                <w:sz w:val="4"/>
+                <w:u w:val="none"/>
+                <w:rFonts w:ascii="Avenir Next" w:hAnsi="Avenir Next" w:cs="Avenir Next"/>
+              </w:rPr>
+            </w:r>
+          </w:p>
+        </w:tc>
+      </w:tr>
+      <w:tr>
+        <w:trPr>
+          <w:trHeight w:val="560" w:hRule="exact"/>
+        </w:trPr>
+        <w:tc>
+          <w:tcPr>
+            <w:tcW w:type="dxa" w:w="10656"/>
+            <w:tcMar>
+              <w:top w:w="0" w:type="dxa"/>
+              <w:left w:w="0" w:type="dxa"/>
+              <w:bottom w:w="0" w:type="dxa"/>
+              <w:right w:w="0" w:type="dxa"/>
+            </w:tcMar>
+            <w:tcBorders>
+              <w:bottom w:val="single" w:sz="8" w:color="1A1D26"/>
+            </w:tcBorders>
+          </w:tcPr>
+          <w:p>
+            <w:pPr>
+              <w:spacing w:before="0" w:after="0" w:line="40" w:lineRule="exact"/>
+            </w:pPr>
+            <w:r>
+              <w:rPr>
+                <w:rFonts w:ascii="Avenir Next" w:hAnsi="Avenir Next"/>
+                <w:b w:val="0"/>
+                <w:i w:val="0"/>
+                <w:color w:val="1A1D26"/>
+                <w:sz w:val="4"/>
+                <w:u w:val="none"/>
+                <w:rFonts w:ascii="Avenir Next" w:hAnsi="Avenir Next" w:cs="Avenir Next"/>
+              </w:rPr>
+            </w:r>
+          </w:p>
+        </w:tc>
+      </w:tr>
+    </w:tbl>
     <w:p>
       <w:pPr>
-        <w:spacing w:before="0" w:after="0" w:line="560" w:lineRule="exact"/>
-        <w:pBdr>
-          <w:bottom w:val="single" w:sz="8" w:space="4" w:color="1A1D26"/>
-        </w:pBdr>
+        <w:spacing w:before="0" w:after="0" w:line="20" w:lineRule="exact"/>
+        <w:rPr>
+          <w:sz w:val="2"/>
+        </w:rPr>
       </w:pPr>
       <w:r>
         <w:rPr>
-          <w:rFonts w:ascii="Avenir Next" w:hAnsi="Avenir Next"/>
-          <w:b w:val="0"/>
-          <w:i w:val="0"/>
-          <w:color w:val="1A1D26"/>
-          <w:sz w:val="29"/>
-          <w:u w:val="none"/>
-          <w:rFonts w:ascii="Avenir Next" w:hAnsi="Avenir Next" w:cs="Avenir Next"/>
-        </w:rPr>
-      </w:r>
-    </w:p>
-    <w:p>
-      <w:pPr>
-        <w:spacing w:before="0" w:after="0" w:line="560" w:lineRule="exact"/>
-        <w:pBdr>
-          <w:bottom w:val="single" w:sz="8" w:space="4" w:color="1A1D26"/>
-        </w:pBdr>
-      </w:pPr>
-      <w:r>
-        <w:rPr>
-          <w:rFonts w:ascii="Avenir Next" w:hAnsi="Avenir Next"/>
-          <w:b w:val="0"/>
-          <w:i w:val="0"/>
-          <w:color w:val="1A1D26"/>
-          <w:sz w:val="29"/>
-          <w:u w:val="none"/>
-          <w:rFonts w:ascii="Avenir Next" w:hAnsi="Avenir Next" w:cs="Avenir Next"/>
-        </w:rPr>
-      </w:r>
-    </w:p>
-    <w:p>
-      <w:pPr>
-        <w:spacing w:before="0" w:after="0" w:line="560" w:lineRule="exact"/>
-        <w:pBdr>
-          <w:bottom w:val="single" w:sz="8" w:space="4" w:color="1A1D26"/>
-        </w:pBdr>
-      </w:pPr>
-      <w:r>
-        <w:rPr>
-          <w:rFonts w:ascii="Avenir Next" w:hAnsi="Avenir Next"/>
-          <w:b w:val="0"/>
-          <w:i w:val="0"/>
-          <w:color w:val="1A1D26"/>
-          <w:sz w:val="29"/>
-          <w:u w:val="none"/>
-          <w:rFonts w:ascii="Avenir Next" w:hAnsi="Avenir Next" w:cs="Avenir Next"/>
+          <w:sz w:val="2"/>
         </w:rPr>
       </w:r>
     </w:p>

</xml_diff>